<commit_message>
Final submission: updated documentation, screenshots, README, and PPT
</commit_message>
<xml_diff>
--- a/InventoryManagement_SiddhiShinde_Documentation.docx
+++ b/InventoryManagement_SiddhiShinde_Documentation.docx
@@ -617,6 +617,12 @@
     <w:p>
       <w:pPr>
         <w:spacing w:after="120"/>
+        <w:rPr>
+          <w:rFonts w:ascii="Calibri" w:hAnsi="Calibri"/>
+          <w:b/>
+          <w:color w:val="0B224E"/>
+          <w:sz w:val="28"/>
+        </w:rPr>
       </w:pPr>
       <w:r>
         <w:rPr>
@@ -630,8 +636,7 @@
     </w:p>
     <w:p>
       <w:pPr>
-        <w:keepNext/>
-        <w:spacing w:before="320" w:after="80"/>
+        <w:spacing w:after="120"/>
         <w:rPr>
           <w:rFonts w:ascii="Calibri" w:hAnsi="Calibri"/>
           <w:b/>
@@ -639,21 +644,16 @@
           <w:sz w:val="28"/>
         </w:rPr>
       </w:pPr>
-    </w:p>
-    <w:p>
-      <w:pPr>
-        <w:keepNext/>
-        <w:spacing w:before="320" w:after="80"/>
-      </w:pPr>
       <w:r>
         <w:rPr>
           <w:noProof/>
         </w:rPr>
+        <w:lastRenderedPageBreak/>
         <w:drawing>
-          <wp:inline distT="0" distB="0" distL="0" distR="0" wp14:anchorId="02EE6D08" wp14:editId="3936FF79">
-            <wp:extent cx="5969000" cy="3482340"/>
-            <wp:effectExtent l="0" t="0" r="0" b="3810"/>
-            <wp:docPr id="392472362" name="Picture 1"/>
+          <wp:inline distT="0" distB="0" distL="0" distR="0" wp14:anchorId="58DCF601" wp14:editId="04709FEE">
+            <wp:extent cx="5943600" cy="2990850"/>
+            <wp:effectExtent l="0" t="0" r="0" b="0"/>
+            <wp:docPr id="1718802900" name="Picture 10"/>
             <wp:cNvGraphicFramePr>
               <a:graphicFrameLocks xmlns:a="http://schemas.openxmlformats.org/drawingml/2006/main" noChangeAspect="1"/>
             </wp:cNvGraphicFramePr>
@@ -661,7 +661,7 @@
               <a:graphicData uri="http://schemas.openxmlformats.org/drawingml/2006/picture">
                 <pic:pic xmlns:pic="http://schemas.openxmlformats.org/drawingml/2006/picture">
                   <pic:nvPicPr>
-                    <pic:cNvPr id="392472362" name="Picture 392472362"/>
+                    <pic:cNvPr id="1718802900" name="Picture 1718802900"/>
                     <pic:cNvPicPr/>
                   </pic:nvPicPr>
                   <pic:blipFill>
@@ -673,7 +673,101 @@
                   <pic:spPr>
                     <a:xfrm>
                       <a:off x="0" y="0"/>
-                      <a:ext cx="5969000" cy="3482340"/>
+                      <a:ext cx="5943600" cy="2990850"/>
+                    </a:xfrm>
+                    <a:prstGeom prst="rect">
+                      <a:avLst/>
+                    </a:prstGeom>
+                  </pic:spPr>
+                </pic:pic>
+              </a:graphicData>
+            </a:graphic>
+          </wp:inline>
+        </w:drawing>
+      </w:r>
+    </w:p>
+    <w:p>
+      <w:pPr>
+        <w:spacing w:after="120"/>
+      </w:pPr>
+      <w:r>
+        <w:rPr>
+          <w:noProof/>
+        </w:rPr>
+        <w:drawing>
+          <wp:inline distT="0" distB="0" distL="0" distR="0" wp14:anchorId="4FB2B006" wp14:editId="7299DC96">
+            <wp:extent cx="5943600" cy="3136900"/>
+            <wp:effectExtent l="0" t="0" r="0" b="6350"/>
+            <wp:docPr id="1943061299" name="Picture 11"/>
+            <wp:cNvGraphicFramePr>
+              <a:graphicFrameLocks xmlns:a="http://schemas.openxmlformats.org/drawingml/2006/main" noChangeAspect="1"/>
+            </wp:cNvGraphicFramePr>
+            <a:graphic xmlns:a="http://schemas.openxmlformats.org/drawingml/2006/main">
+              <a:graphicData uri="http://schemas.openxmlformats.org/drawingml/2006/picture">
+                <pic:pic xmlns:pic="http://schemas.openxmlformats.org/drawingml/2006/picture">
+                  <pic:nvPicPr>
+                    <pic:cNvPr id="1943061299" name="Picture 1943061299"/>
+                    <pic:cNvPicPr/>
+                  </pic:nvPicPr>
+                  <pic:blipFill>
+                    <a:blip r:embed="rId7"/>
+                    <a:stretch>
+                      <a:fillRect/>
+                    </a:stretch>
+                  </pic:blipFill>
+                  <pic:spPr>
+                    <a:xfrm>
+                      <a:off x="0" y="0"/>
+                      <a:ext cx="5943600" cy="3136900"/>
+                    </a:xfrm>
+                    <a:prstGeom prst="rect">
+                      <a:avLst/>
+                    </a:prstGeom>
+                  </pic:spPr>
+                </pic:pic>
+              </a:graphicData>
+            </a:graphic>
+          </wp:inline>
+        </w:drawing>
+      </w:r>
+    </w:p>
+    <w:p>
+      <w:pPr>
+        <w:spacing w:after="120"/>
+        <w:rPr>
+          <w:noProof/>
+        </w:rPr>
+      </w:pPr>
+      <w:r>
+        <w:rPr>
+          <w:noProof/>
+        </w:rPr>
+        <w:lastRenderedPageBreak/>
+        <w:drawing>
+          <wp:inline distT="0" distB="0" distL="0" distR="0" wp14:anchorId="0D5428DB" wp14:editId="6C0F2B98">
+            <wp:extent cx="5943600" cy="3270250"/>
+            <wp:effectExtent l="0" t="0" r="0" b="6350"/>
+            <wp:docPr id="1015957246" name="Picture 13"/>
+            <wp:cNvGraphicFramePr>
+              <a:graphicFrameLocks xmlns:a="http://schemas.openxmlformats.org/drawingml/2006/main" noChangeAspect="1"/>
+            </wp:cNvGraphicFramePr>
+            <a:graphic xmlns:a="http://schemas.openxmlformats.org/drawingml/2006/main">
+              <a:graphicData uri="http://schemas.openxmlformats.org/drawingml/2006/picture">
+                <pic:pic xmlns:pic="http://schemas.openxmlformats.org/drawingml/2006/picture">
+                  <pic:nvPicPr>
+                    <pic:cNvPr id="1015957246" name="Picture 1015957246"/>
+                    <pic:cNvPicPr/>
+                  </pic:nvPicPr>
+                  <pic:blipFill>
+                    <a:blip r:embed="rId8"/>
+                    <a:stretch>
+                      <a:fillRect/>
+                    </a:stretch>
+                  </pic:blipFill>
+                  <pic:spPr>
+                    <a:xfrm>
+                      <a:off x="0" y="0"/>
+                      <a:ext cx="5943600" cy="3270250"/>
                     </a:xfrm>
                     <a:prstGeom prst="rect">
                       <a:avLst/>
@@ -690,10 +784,10 @@
           <w:noProof/>
         </w:rPr>
         <w:drawing>
-          <wp:inline distT="0" distB="0" distL="0" distR="0" wp14:anchorId="7C735100" wp14:editId="106BF1AE">
-            <wp:extent cx="5943600" cy="3909849"/>
+          <wp:inline distT="0" distB="0" distL="0" distR="0" wp14:anchorId="4AB4F68D" wp14:editId="2571FED3">
+            <wp:extent cx="5943600" cy="3124200"/>
             <wp:effectExtent l="0" t="0" r="0" b="0"/>
-            <wp:docPr id="1869759581" name="Picture 2"/>
+            <wp:docPr id="116211219" name="Picture 14"/>
             <wp:cNvGraphicFramePr>
               <a:graphicFrameLocks xmlns:a="http://schemas.openxmlformats.org/drawingml/2006/main" noChangeAspect="1"/>
             </wp:cNvGraphicFramePr>
@@ -701,11 +795,11 @@
               <a:graphicData uri="http://schemas.openxmlformats.org/drawingml/2006/picture">
                 <pic:pic xmlns:pic="http://schemas.openxmlformats.org/drawingml/2006/picture">
                   <pic:nvPicPr>
-                    <pic:cNvPr id="1869759581" name="Picture 1869759581"/>
+                    <pic:cNvPr id="116211219" name="Picture 116211219"/>
                     <pic:cNvPicPr/>
                   </pic:nvPicPr>
                   <pic:blipFill>
-                    <a:blip r:embed="rId7"/>
+                    <a:blip r:embed="rId9"/>
                     <a:stretch>
                       <a:fillRect/>
                     </a:stretch>
@@ -713,7 +807,7 @@
                   <pic:spPr>
                     <a:xfrm>
                       <a:off x="0" y="0"/>
-                      <a:ext cx="5947796" cy="3912609"/>
+                      <a:ext cx="5943600" cy="3124200"/>
                     </a:xfrm>
                     <a:prstGeom prst="rect">
                       <a:avLst/>
@@ -731,10 +825,10 @@
         </w:rPr>
         <w:lastRenderedPageBreak/>
         <w:drawing>
-          <wp:inline distT="0" distB="0" distL="0" distR="0" wp14:anchorId="39B680C3" wp14:editId="24C157BB">
-            <wp:extent cx="5943600" cy="3120390"/>
-            <wp:effectExtent l="0" t="0" r="0" b="3810"/>
-            <wp:docPr id="1113129968" name="Picture 3"/>
+          <wp:inline distT="0" distB="0" distL="0" distR="0" wp14:anchorId="5E2AC0F2" wp14:editId="7C71EDD7">
+            <wp:extent cx="5943600" cy="2990850"/>
+            <wp:effectExtent l="0" t="0" r="0" b="0"/>
+            <wp:docPr id="2054822560" name="Picture 15"/>
             <wp:cNvGraphicFramePr>
               <a:graphicFrameLocks xmlns:a="http://schemas.openxmlformats.org/drawingml/2006/main" noChangeAspect="1"/>
             </wp:cNvGraphicFramePr>
@@ -742,11 +836,11 @@
               <a:graphicData uri="http://schemas.openxmlformats.org/drawingml/2006/picture">
                 <pic:pic xmlns:pic="http://schemas.openxmlformats.org/drawingml/2006/picture">
                   <pic:nvPicPr>
-                    <pic:cNvPr id="1113129968" name="Picture 1113129968"/>
+                    <pic:cNvPr id="2054822560" name="Picture 2054822560"/>
                     <pic:cNvPicPr/>
                   </pic:nvPicPr>
                   <pic:blipFill>
-                    <a:blip r:embed="rId8"/>
+                    <a:blip r:embed="rId10"/>
                     <a:stretch>
                       <a:fillRect/>
                     </a:stretch>
@@ -754,7 +848,7 @@
                   <pic:spPr>
                     <a:xfrm>
                       <a:off x="0" y="0"/>
-                      <a:ext cx="5943600" cy="3120390"/>
+                      <a:ext cx="5943600" cy="2990850"/>
                     </a:xfrm>
                     <a:prstGeom prst="rect">
                       <a:avLst/>
@@ -771,10 +865,10 @@
           <w:noProof/>
         </w:rPr>
         <w:drawing>
-          <wp:inline distT="0" distB="0" distL="0" distR="0" wp14:anchorId="0741DAE9" wp14:editId="0990AD5A">
-            <wp:extent cx="5943600" cy="3120390"/>
-            <wp:effectExtent l="0" t="0" r="0" b="3810"/>
-            <wp:docPr id="180386750" name="Picture 4"/>
+          <wp:inline distT="0" distB="0" distL="0" distR="0" wp14:anchorId="49B0E098" wp14:editId="4D625CB1">
+            <wp:extent cx="5943600" cy="3092450"/>
+            <wp:effectExtent l="0" t="0" r="0" b="0"/>
+            <wp:docPr id="2074462663" name="Picture 16"/>
             <wp:cNvGraphicFramePr>
               <a:graphicFrameLocks xmlns:a="http://schemas.openxmlformats.org/drawingml/2006/main" noChangeAspect="1"/>
             </wp:cNvGraphicFramePr>
@@ -782,11 +876,11 @@
               <a:graphicData uri="http://schemas.openxmlformats.org/drawingml/2006/picture">
                 <pic:pic xmlns:pic="http://schemas.openxmlformats.org/drawingml/2006/picture">
                   <pic:nvPicPr>
-                    <pic:cNvPr id="180386750" name="Picture 180386750"/>
+                    <pic:cNvPr id="2074462663" name="Picture 2074462663"/>
                     <pic:cNvPicPr/>
                   </pic:nvPicPr>
                   <pic:blipFill>
-                    <a:blip r:embed="rId9"/>
+                    <a:blip r:embed="rId11"/>
                     <a:stretch>
                       <a:fillRect/>
                     </a:stretch>
@@ -794,7 +888,7 @@
                   <pic:spPr>
                     <a:xfrm>
                       <a:off x="0" y="0"/>
-                      <a:ext cx="5943600" cy="3120390"/>
+                      <a:ext cx="5943600" cy="3092450"/>
                     </a:xfrm>
                     <a:prstGeom prst="rect">
                       <a:avLst/>
@@ -812,10 +906,10 @@
         </w:rPr>
         <w:lastRenderedPageBreak/>
         <w:drawing>
-          <wp:inline distT="0" distB="0" distL="0" distR="0" wp14:anchorId="53CAAE48" wp14:editId="3A4742D5">
-            <wp:extent cx="5943600" cy="3120390"/>
-            <wp:effectExtent l="0" t="0" r="0" b="3810"/>
-            <wp:docPr id="1797093622" name="Picture 5"/>
+          <wp:inline distT="0" distB="0" distL="0" distR="0" wp14:anchorId="5C0BC28D" wp14:editId="7BBA2C21">
+            <wp:extent cx="5943600" cy="3048000"/>
+            <wp:effectExtent l="0" t="0" r="0" b="0"/>
+            <wp:docPr id="773790438" name="Picture 17"/>
             <wp:cNvGraphicFramePr>
               <a:graphicFrameLocks xmlns:a="http://schemas.openxmlformats.org/drawingml/2006/main" noChangeAspect="1"/>
             </wp:cNvGraphicFramePr>
@@ -823,11 +917,11 @@
               <a:graphicData uri="http://schemas.openxmlformats.org/drawingml/2006/picture">
                 <pic:pic xmlns:pic="http://schemas.openxmlformats.org/drawingml/2006/picture">
                   <pic:nvPicPr>
-                    <pic:cNvPr id="1797093622" name="Picture 1797093622"/>
+                    <pic:cNvPr id="773790438" name="Picture 773790438"/>
                     <pic:cNvPicPr/>
                   </pic:nvPicPr>
                   <pic:blipFill>
-                    <a:blip r:embed="rId10"/>
+                    <a:blip r:embed="rId12"/>
                     <a:stretch>
                       <a:fillRect/>
                     </a:stretch>
@@ -835,7 +929,7 @@
                   <pic:spPr>
                     <a:xfrm>
                       <a:off x="0" y="0"/>
-                      <a:ext cx="5943600" cy="3120390"/>
+                      <a:ext cx="5943600" cy="3048000"/>
                     </a:xfrm>
                     <a:prstGeom prst="rect">
                       <a:avLst/>
@@ -852,10 +946,10 @@
           <w:noProof/>
         </w:rPr>
         <w:drawing>
-          <wp:inline distT="0" distB="0" distL="0" distR="0" wp14:anchorId="32B3425C" wp14:editId="39CDE9D4">
-            <wp:extent cx="5943600" cy="3120390"/>
-            <wp:effectExtent l="0" t="0" r="0" b="3810"/>
-            <wp:docPr id="384367975" name="Picture 6"/>
+          <wp:inline distT="0" distB="0" distL="0" distR="0" wp14:anchorId="65C01ED8" wp14:editId="55B5B71A">
+            <wp:extent cx="5943600" cy="3105150"/>
+            <wp:effectExtent l="0" t="0" r="0" b="0"/>
+            <wp:docPr id="159797962" name="Picture 18"/>
             <wp:cNvGraphicFramePr>
               <a:graphicFrameLocks xmlns:a="http://schemas.openxmlformats.org/drawingml/2006/main" noChangeAspect="1"/>
             </wp:cNvGraphicFramePr>
@@ -863,11 +957,11 @@
               <a:graphicData uri="http://schemas.openxmlformats.org/drawingml/2006/picture">
                 <pic:pic xmlns:pic="http://schemas.openxmlformats.org/drawingml/2006/picture">
                   <pic:nvPicPr>
-                    <pic:cNvPr id="384367975" name="Picture 384367975"/>
+                    <pic:cNvPr id="159797962" name="Picture 159797962"/>
                     <pic:cNvPicPr/>
                   </pic:nvPicPr>
                   <pic:blipFill>
-                    <a:blip r:embed="rId11"/>
+                    <a:blip r:embed="rId13"/>
                     <a:stretch>
                       <a:fillRect/>
                     </a:stretch>
@@ -875,7 +969,7 @@
                   <pic:spPr>
                     <a:xfrm>
                       <a:off x="0" y="0"/>
-                      <a:ext cx="5943600" cy="3120390"/>
+                      <a:ext cx="5943600" cy="3105150"/>
                     </a:xfrm>
                     <a:prstGeom prst="rect">
                       <a:avLst/>
@@ -887,16 +981,30 @@
           </wp:inline>
         </w:drawing>
       </w:r>
+    </w:p>
+    <w:p/>
+    <w:p/>
+    <w:p>
+      <w:pPr>
+        <w:keepNext/>
+        <w:spacing w:before="320" w:after="80"/>
+        <w:rPr>
+          <w:rFonts w:ascii="Calibri" w:hAnsi="Calibri"/>
+          <w:b/>
+          <w:color w:val="0B224E"/>
+          <w:sz w:val="28"/>
+        </w:rPr>
+      </w:pPr>
       <w:r>
         <w:rPr>
           <w:noProof/>
         </w:rPr>
         <w:lastRenderedPageBreak/>
         <w:drawing>
-          <wp:inline distT="0" distB="0" distL="0" distR="0" wp14:anchorId="0C4906C5" wp14:editId="5842FD55">
-            <wp:extent cx="5943600" cy="3120390"/>
-            <wp:effectExtent l="0" t="0" r="0" b="3810"/>
-            <wp:docPr id="1020243485" name="Picture 7"/>
+          <wp:inline distT="0" distB="0" distL="0" distR="0" wp14:anchorId="2B9F76B3" wp14:editId="362CDA6C">
+            <wp:extent cx="5943600" cy="2984500"/>
+            <wp:effectExtent l="0" t="0" r="0" b="6350"/>
+            <wp:docPr id="1837577942" name="Picture 12"/>
             <wp:cNvGraphicFramePr>
               <a:graphicFrameLocks xmlns:a="http://schemas.openxmlformats.org/drawingml/2006/main" noChangeAspect="1"/>
             </wp:cNvGraphicFramePr>
@@ -904,11 +1012,11 @@
               <a:graphicData uri="http://schemas.openxmlformats.org/drawingml/2006/picture">
                 <pic:pic xmlns:pic="http://schemas.openxmlformats.org/drawingml/2006/picture">
                   <pic:nvPicPr>
-                    <pic:cNvPr id="1020243485" name="Picture 1020243485"/>
+                    <pic:cNvPr id="1837577942" name="Picture 1837577942"/>
                     <pic:cNvPicPr/>
                   </pic:nvPicPr>
                   <pic:blipFill>
-                    <a:blip r:embed="rId12"/>
+                    <a:blip r:embed="rId14"/>
                     <a:stretch>
                       <a:fillRect/>
                     </a:stretch>
@@ -916,7 +1024,7 @@
                   <pic:spPr>
                     <a:xfrm>
                       <a:off x="0" y="0"/>
-                      <a:ext cx="5943600" cy="3120390"/>
+                      <a:ext cx="5943600" cy="2984500"/>
                     </a:xfrm>
                     <a:prstGeom prst="rect">
                       <a:avLst/>
@@ -928,87 +1036,12 @@
           </wp:inline>
         </w:drawing>
       </w:r>
-      <w:r>
-        <w:rPr>
-          <w:noProof/>
-        </w:rPr>
-        <w:drawing>
-          <wp:inline distT="0" distB="0" distL="0" distR="0" wp14:anchorId="19BB5CDE" wp14:editId="4B18C57A">
-            <wp:extent cx="5943600" cy="3601329"/>
-            <wp:effectExtent l="0" t="0" r="0" b="0"/>
-            <wp:docPr id="1040672727" name="Picture 8"/>
-            <wp:cNvGraphicFramePr>
-              <a:graphicFrameLocks xmlns:a="http://schemas.openxmlformats.org/drawingml/2006/main" noChangeAspect="1"/>
-            </wp:cNvGraphicFramePr>
-            <a:graphic xmlns:a="http://schemas.openxmlformats.org/drawingml/2006/main">
-              <a:graphicData uri="http://schemas.openxmlformats.org/drawingml/2006/picture">
-                <pic:pic xmlns:pic="http://schemas.openxmlformats.org/drawingml/2006/picture">
-                  <pic:nvPicPr>
-                    <pic:cNvPr id="1040672727" name="Picture 1040672727"/>
-                    <pic:cNvPicPr/>
-                  </pic:nvPicPr>
-                  <pic:blipFill>
-                    <a:blip r:embed="rId13"/>
-                    <a:stretch>
-                      <a:fillRect/>
-                    </a:stretch>
-                  </pic:blipFill>
-                  <pic:spPr>
-                    <a:xfrm>
-                      <a:off x="0" y="0"/>
-                      <a:ext cx="5950497" cy="3605508"/>
-                    </a:xfrm>
-                    <a:prstGeom prst="rect">
-                      <a:avLst/>
-                    </a:prstGeom>
-                  </pic:spPr>
-                </pic:pic>
-              </a:graphicData>
-            </a:graphic>
-          </wp:inline>
-        </w:drawing>
-      </w:r>
-      <w:r>
-        <w:rPr>
-          <w:noProof/>
-        </w:rPr>
-        <w:lastRenderedPageBreak/>
-        <w:drawing>
-          <wp:inline distT="0" distB="0" distL="0" distR="0" wp14:anchorId="2D1E2BC0" wp14:editId="0D07A2B6">
-            <wp:extent cx="5943600" cy="3334043"/>
-            <wp:effectExtent l="0" t="0" r="0" b="0"/>
-            <wp:docPr id="547157115" name="Picture 9"/>
-            <wp:cNvGraphicFramePr>
-              <a:graphicFrameLocks xmlns:a="http://schemas.openxmlformats.org/drawingml/2006/main" noChangeAspect="1"/>
-            </wp:cNvGraphicFramePr>
-            <a:graphic xmlns:a="http://schemas.openxmlformats.org/drawingml/2006/main">
-              <a:graphicData uri="http://schemas.openxmlformats.org/drawingml/2006/picture">
-                <pic:pic xmlns:pic="http://schemas.openxmlformats.org/drawingml/2006/picture">
-                  <pic:nvPicPr>
-                    <pic:cNvPr id="547157115" name="Picture 547157115"/>
-                    <pic:cNvPicPr/>
-                  </pic:nvPicPr>
-                  <pic:blipFill>
-                    <a:blip r:embed="rId14"/>
-                    <a:stretch>
-                      <a:fillRect/>
-                    </a:stretch>
-                  </pic:blipFill>
-                  <pic:spPr>
-                    <a:xfrm>
-                      <a:off x="0" y="0"/>
-                      <a:ext cx="5946816" cy="3335847"/>
-                    </a:xfrm>
-                    <a:prstGeom prst="rect">
-                      <a:avLst/>
-                    </a:prstGeom>
-                  </pic:spPr>
-                </pic:pic>
-              </a:graphicData>
-            </a:graphic>
-          </wp:inline>
-        </w:drawing>
-      </w:r>
+    </w:p>
+    <w:p>
+      <w:pPr>
+        <w:keepNext/>
+        <w:spacing w:before="320" w:after="80"/>
+      </w:pPr>
     </w:p>
     <w:p>
       <w:pPr>
@@ -1167,16 +1200,7 @@
           <w:color w:val="0B224E"/>
           <w:sz w:val="28"/>
         </w:rPr>
-        <w:t>9</w:t>
-      </w:r>
-      <w:r>
-        <w:rPr>
-          <w:rFonts w:ascii="Calibri" w:hAnsi="Calibri"/>
-          <w:b/>
-          <w:color w:val="0B224E"/>
-          <w:sz w:val="28"/>
-        </w:rPr>
-        <w:t>. Learning Outcomes</w:t>
+        <w:t>9. Learning Outcomes</w:t>
       </w:r>
     </w:p>
     <w:p>
@@ -1295,6 +1319,7 @@
           <w:color w:val="0B224E"/>
           <w:sz w:val="28"/>
         </w:rPr>
+        <w:lastRenderedPageBreak/>
         <w:t>10. Future Enhancements</w:t>
       </w:r>
     </w:p>
@@ -1308,16 +1333,7 @@
           <w:b/>
           <w:color w:val="282828"/>
         </w:rPr>
-        <w:lastRenderedPageBreak/>
-        <w:t>•</w:t>
-      </w:r>
-      <w:r>
-        <w:rPr>
-          <w:rFonts w:ascii="Calibri" w:hAnsi="Calibri"/>
-          <w:b/>
-          <w:color w:val="282828"/>
-        </w:rPr>
-        <w:t xml:space="preserve"> Barcode Scanner API Integration:</w:t>
+        <w:t>• Barcode Scanner API Integration:</w:t>
       </w:r>
       <w:r>
         <w:rPr>
@@ -1392,15 +1408,7 @@
           <w:b/>
           <w:color w:val="282828"/>
         </w:rPr>
-        <w:t>🔗</w:t>
-      </w:r>
-      <w:r>
-        <w:rPr>
-          <w:rFonts w:ascii="Calibri" w:hAnsi="Calibri"/>
-          <w:b/>
-          <w:color w:val="282828"/>
-        </w:rPr>
-        <w:t xml:space="preserve"> Repository URL: </w:t>
+        <w:t xml:space="preserve">🔗 Repository URL: </w:t>
       </w:r>
       <w:r>
         <w:rPr>
@@ -2458,6 +2466,7 @@
   <w:style w:type="character" w:default="1" w:styleId="DefaultParagraphFont">
     <w:name w:val="Default Paragraph Font"/>
     <w:uiPriority w:val="1"/>
+    <w:semiHidden/>
     <w:unhideWhenUsed/>
   </w:style>
   <w:style w:type="table" w:default="1" w:styleId="TableNormal">

</xml_diff>